<commit_message>
modificacion y subida entregables
</commit_message>
<xml_diff>
--- a/f3_s02_entregable_grupo9.docx
+++ b/f3_s02_entregable_grupo9.docx
@@ -11,7 +11,7 @@
           <w:noProof/>
         </w:rPr>
         <w:drawing>
-          <wp:inline distT="0" distB="0" distL="0" distR="0" wp14:anchorId="18872E8D" wp14:editId="15119A23">
+          <wp:inline distT="0" distB="0" distL="0" distR="0" wp14:anchorId="2DD72506" wp14:editId="31B43597">
             <wp:extent cx="1417320" cy="1144102"/>
             <wp:effectExtent l="0" t="0" r="0" b="0"/>
             <wp:docPr id="1" name="Picture 1"/>
@@ -178,7 +178,7 @@
       <w:pPr>
         <w:pStyle w:val="Ttulo1"/>
       </w:pPr>
-      <w:bookmarkStart w:id="0" w:name="_Toc241973886"/>
+      <w:bookmarkStart w:id="0" w:name="_Toc241974517"/>
       <w:r>
         <w:t>Índice</w:t>
       </w:r>
@@ -210,7 +210,7 @@
       <w:r>
         <w:fldChar w:fldCharType="separate"/>
       </w:r>
-      <w:hyperlink w:anchor="_Toc241973886" w:history="1">
+      <w:hyperlink w:anchor="_Toc241974517" w:history="1">
         <w:r>
           <w:rPr>
             <w:rStyle w:val="Hipervnculo"/>
@@ -237,7 +237,7 @@
             <w:noProof/>
             <w:webHidden/>
           </w:rPr>
-          <w:instrText xml:space="preserve"> PAGEREF _Toc241973886 \h </w:instrText>
+          <w:instrText xml:space="preserve"> PAGEREF _Toc241974517 \h </w:instrText>
         </w:r>
         <w:r>
           <w:rPr>
@@ -285,13 +285,13 @@
           <w14:ligatures w14:val="standardContextual"/>
         </w:rPr>
       </w:pPr>
-      <w:hyperlink w:anchor="_Toc241973887" w:history="1">
+      <w:hyperlink w:anchor="_Toc241974518" w:history="1">
         <w:r>
           <w:rPr>
             <w:rStyle w:val="Hipervnculo"/>
             <w:noProof/>
           </w:rPr>
-          <w:t>Introducción</w:t>
+          <w:t>1 Introducción</w:t>
         </w:r>
         <w:r>
           <w:rPr>
@@ -312,7 +312,7 @@
             <w:noProof/>
             <w:webHidden/>
           </w:rPr>
-          <w:instrText xml:space="preserve"> PAGEREF _Toc241973887 \h </w:instrText>
+          <w:instrText xml:space="preserve"> PAGEREF _Toc241974518 \h </w:instrText>
         </w:r>
         <w:r>
           <w:rPr>
@@ -360,13 +360,13 @@
           <w14:ligatures w14:val="standardContextual"/>
         </w:rPr>
       </w:pPr>
-      <w:hyperlink w:anchor="_Toc241973888" w:history="1">
+      <w:hyperlink w:anchor="_Toc241974519" w:history="1">
         <w:r>
           <w:rPr>
             <w:rStyle w:val="Hipervnculo"/>
             <w:noProof/>
           </w:rPr>
-          <w:t>II Diseño de soluciones algorítmicas</w:t>
+          <w:t>2 Diseño de soluciones algorítmicas</w:t>
         </w:r>
         <w:r>
           <w:rPr>
@@ -387,7 +387,7 @@
             <w:noProof/>
             <w:webHidden/>
           </w:rPr>
-          <w:instrText xml:space="preserve"> PAGEREF _Toc241973888 \h </w:instrText>
+          <w:instrText xml:space="preserve"> PAGEREF _Toc241974519 \h </w:instrText>
         </w:r>
         <w:r>
           <w:rPr>
@@ -435,13 +435,13 @@
           <w14:ligatures w14:val="standardContextual"/>
         </w:rPr>
       </w:pPr>
-      <w:hyperlink w:anchor="_Toc241973889" w:history="1">
+      <w:hyperlink w:anchor="_Toc241974520" w:history="1">
         <w:r>
           <w:rPr>
             <w:rStyle w:val="Hipervnculo"/>
             <w:noProof/>
           </w:rPr>
-          <w:t>II.a Codificación funcional y arquitectura del script</w:t>
+          <w:t>2.1 Codificación funcional y arquitectura del script</w:t>
         </w:r>
         <w:r>
           <w:rPr>
@@ -462,7 +462,7 @@
             <w:noProof/>
             <w:webHidden/>
           </w:rPr>
-          <w:instrText xml:space="preserve"> PAGEREF _Toc241973889 \h </w:instrText>
+          <w:instrText xml:space="preserve"> PAGEREF _Toc241974520 \h </w:instrText>
         </w:r>
         <w:r>
           <w:rPr>
@@ -510,13 +510,13 @@
           <w14:ligatures w14:val="standardContextual"/>
         </w:rPr>
       </w:pPr>
-      <w:hyperlink w:anchor="_Toc241973890" w:history="1">
+      <w:hyperlink w:anchor="_Toc241974521" w:history="1">
         <w:r>
           <w:rPr>
             <w:rStyle w:val="Hipervnculo"/>
             <w:noProof/>
           </w:rPr>
-          <w:t>II.b Preprocesamiento y transformación del conjunto</w:t>
+          <w:t>2.2 Preprocesamiento y transformación del conjunto</w:t>
         </w:r>
         <w:r>
           <w:rPr>
@@ -537,7 +537,7 @@
             <w:noProof/>
             <w:webHidden/>
           </w:rPr>
-          <w:instrText xml:space="preserve"> PAGEREF _Toc241973890 \h </w:instrText>
+          <w:instrText xml:space="preserve"> PAGEREF _Toc241974521 \h </w:instrText>
         </w:r>
         <w:r>
           <w:rPr>
@@ -585,13 +585,13 @@
           <w14:ligatures w14:val="standardContextual"/>
         </w:rPr>
       </w:pPr>
-      <w:hyperlink w:anchor="_Toc241973891" w:history="1">
+      <w:hyperlink w:anchor="_Toc241974522" w:history="1">
         <w:r>
           <w:rPr>
             <w:rStyle w:val="Hipervnculo"/>
             <w:noProof/>
           </w:rPr>
-          <w:t>II.c Validación técnica y verificación del código</w:t>
+          <w:t>2.3 Validación técnica y verificación del código</w:t>
         </w:r>
         <w:r>
           <w:rPr>
@@ -612,7 +612,7 @@
             <w:noProof/>
             <w:webHidden/>
           </w:rPr>
-          <w:instrText xml:space="preserve"> PAGEREF _Toc241973891 \h </w:instrText>
+          <w:instrText xml:space="preserve"> PAGEREF _Toc241974522 \h </w:instrText>
         </w:r>
         <w:r>
           <w:rPr>
@@ -660,13 +660,13 @@
           <w14:ligatures w14:val="standardContextual"/>
         </w:rPr>
       </w:pPr>
-      <w:hyperlink w:anchor="_Toc241973892" w:history="1">
+      <w:hyperlink w:anchor="_Toc241974523" w:history="1">
         <w:r>
           <w:rPr>
             <w:rStyle w:val="Hipervnculo"/>
             <w:noProof/>
           </w:rPr>
-          <w:t>II.d Eficiencia y oportunidades de optimización</w:t>
+          <w:t>2.4 Eficiencia y oportunidades de optimización</w:t>
         </w:r>
         <w:r>
           <w:rPr>
@@ -687,7 +687,7 @@
             <w:noProof/>
             <w:webHidden/>
           </w:rPr>
-          <w:instrText xml:space="preserve"> PAGEREF _Toc241973892 \h </w:instrText>
+          <w:instrText xml:space="preserve"> PAGEREF _Toc241974523 \h </w:instrText>
         </w:r>
         <w:r>
           <w:rPr>
@@ -735,13 +735,13 @@
           <w14:ligatures w14:val="standardContextual"/>
         </w:rPr>
       </w:pPr>
-      <w:hyperlink w:anchor="_Toc241973893" w:history="1">
+      <w:hyperlink w:anchor="_Toc241974524" w:history="1">
         <w:r>
           <w:rPr>
             <w:rStyle w:val="Hipervnculo"/>
             <w:noProof/>
           </w:rPr>
-          <w:t>II.e Diseño estructurado división funcional y escalabilidad</w:t>
+          <w:t>2.5 Diseño estructurado división funcional y escalabilidad</w:t>
         </w:r>
         <w:r>
           <w:rPr>
@@ -762,7 +762,7 @@
             <w:noProof/>
             <w:webHidden/>
           </w:rPr>
-          <w:instrText xml:space="preserve"> PAGEREF _Toc241973893 \h </w:instrText>
+          <w:instrText xml:space="preserve"> PAGEREF _Toc241974524 \h </w:instrText>
         </w:r>
         <w:r>
           <w:rPr>
@@ -810,13 +810,13 @@
           <w14:ligatures w14:val="standardContextual"/>
         </w:rPr>
       </w:pPr>
-      <w:hyperlink w:anchor="_Toc241973894" w:history="1">
+      <w:hyperlink w:anchor="_Toc241974525" w:history="1">
         <w:r>
           <w:rPr>
             <w:rStyle w:val="Hipervnculo"/>
             <w:noProof/>
           </w:rPr>
-          <w:t>III Código modular y robusto</w:t>
+          <w:t>3 Código modular y robusto</w:t>
         </w:r>
         <w:r>
           <w:rPr>
@@ -837,7 +837,7 @@
             <w:noProof/>
             <w:webHidden/>
           </w:rPr>
-          <w:instrText xml:space="preserve"> PAGEREF _Toc241973894 \h </w:instrText>
+          <w:instrText xml:space="preserve"> PAGEREF _Toc241974525 \h </w:instrText>
         </w:r>
         <w:r>
           <w:rPr>
@@ -885,13 +885,13 @@
           <w14:ligatures w14:val="standardContextual"/>
         </w:rPr>
       </w:pPr>
-      <w:hyperlink w:anchor="_Toc241973895" w:history="1">
+      <w:hyperlink w:anchor="_Toc241974526" w:history="1">
         <w:r>
           <w:rPr>
             <w:rStyle w:val="Hipervnculo"/>
             <w:noProof/>
           </w:rPr>
-          <w:t>III.a Programación orientada a objetos</w:t>
+          <w:t>3.1 Programación orientada a objetos</w:t>
         </w:r>
         <w:r>
           <w:rPr>
@@ -912,7 +912,7 @@
             <w:noProof/>
             <w:webHidden/>
           </w:rPr>
-          <w:instrText xml:space="preserve"> PAGEREF _Toc241973895 \h </w:instrText>
+          <w:instrText xml:space="preserve"> PAGEREF _Toc241974526 \h </w:instrText>
         </w:r>
         <w:r>
           <w:rPr>
@@ -960,13 +960,13 @@
           <w14:ligatures w14:val="standardContextual"/>
         </w:rPr>
       </w:pPr>
-      <w:hyperlink w:anchor="_Toc241973896" w:history="1">
+      <w:hyperlink w:anchor="_Toc241974527" w:history="1">
         <w:r>
           <w:rPr>
             <w:rStyle w:val="Hipervnculo"/>
             <w:noProof/>
           </w:rPr>
-          <w:t>III.b Arquitectura funcionalidad y patrón Factory</w:t>
+          <w:t>3.2 Arquitectura funcionalidad y patrón Factory</w:t>
         </w:r>
         <w:r>
           <w:rPr>
@@ -987,7 +987,7 @@
             <w:noProof/>
             <w:webHidden/>
           </w:rPr>
-          <w:instrText xml:space="preserve"> PAGEREF _Toc241973896 \h </w:instrText>
+          <w:instrText xml:space="preserve"> PAGEREF _Toc241974527 \h </w:instrText>
         </w:r>
         <w:r>
           <w:rPr>
@@ -1035,13 +1035,13 @@
           <w14:ligatures w14:val="standardContextual"/>
         </w:rPr>
       </w:pPr>
-      <w:hyperlink w:anchor="_Toc241973897" w:history="1">
+      <w:hyperlink w:anchor="_Toc241974528" w:history="1">
         <w:r>
           <w:rPr>
             <w:rStyle w:val="Hipervnculo"/>
             <w:noProof/>
           </w:rPr>
-          <w:t>IV Repositorio GitHub</w:t>
+          <w:t>4 Repositorio GitHub</w:t>
         </w:r>
         <w:r>
           <w:rPr>
@@ -1062,7 +1062,7 @@
             <w:noProof/>
             <w:webHidden/>
           </w:rPr>
-          <w:instrText xml:space="preserve"> PAGEREF _Toc241973897 \h </w:instrText>
+          <w:instrText xml:space="preserve"> PAGEREF _Toc241974528 \h </w:instrText>
         </w:r>
         <w:r>
           <w:rPr>
@@ -1110,13 +1110,13 @@
           <w14:ligatures w14:val="standardContextual"/>
         </w:rPr>
       </w:pPr>
-      <w:hyperlink w:anchor="_Toc241973898" w:history="1">
+      <w:hyperlink w:anchor="_Toc241974529" w:history="1">
         <w:r>
           <w:rPr>
             <w:rStyle w:val="Hipervnculo"/>
             <w:noProof/>
           </w:rPr>
-          <w:t>V Notebook ejecutable y productos</w:t>
+          <w:t>5 Notebook ejecutable y productos</w:t>
         </w:r>
         <w:r>
           <w:rPr>
@@ -1137,7 +1137,7 @@
             <w:noProof/>
             <w:webHidden/>
           </w:rPr>
-          <w:instrText xml:space="preserve"> PAGEREF _Toc241973898 \h </w:instrText>
+          <w:instrText xml:space="preserve"> PAGEREF _Toc241974529 \h </w:instrText>
         </w:r>
         <w:r>
           <w:rPr>
@@ -1185,13 +1185,13 @@
           <w14:ligatures w14:val="standardContextual"/>
         </w:rPr>
       </w:pPr>
-      <w:hyperlink w:anchor="_Toc241973899" w:history="1">
+      <w:hyperlink w:anchor="_Toc241974530" w:history="1">
         <w:r>
           <w:rPr>
             <w:rStyle w:val="Hipervnculo"/>
             <w:noProof/>
           </w:rPr>
-          <w:t>Conclusiones</w:t>
+          <w:t>6 Conclusiones</w:t>
         </w:r>
         <w:r>
           <w:rPr>
@@ -1212,7 +1212,7 @@
             <w:noProof/>
             <w:webHidden/>
           </w:rPr>
-          <w:instrText xml:space="preserve"> PAGEREF _Toc241973899 \h </w:instrText>
+          <w:instrText xml:space="preserve"> PAGEREF _Toc241974530 \h </w:instrText>
         </w:r>
         <w:r>
           <w:rPr>
@@ -1260,13 +1260,13 @@
           <w14:ligatures w14:val="standardContextual"/>
         </w:rPr>
       </w:pPr>
-      <w:hyperlink w:anchor="_Toc241973900" w:history="1">
+      <w:hyperlink w:anchor="_Toc241974531" w:history="1">
         <w:r>
           <w:rPr>
             <w:rStyle w:val="Hipervnculo"/>
             <w:noProof/>
           </w:rPr>
-          <w:t>VI Bibliografía y aspectos formales</w:t>
+          <w:t>7 Bibliografía y aspectos formales</w:t>
         </w:r>
         <w:r>
           <w:rPr>
@@ -1287,7 +1287,7 @@
             <w:noProof/>
             <w:webHidden/>
           </w:rPr>
-          <w:instrText xml:space="preserve"> PAGEREF _Toc241973900 \h </w:instrText>
+          <w:instrText xml:space="preserve"> PAGEREF _Toc241974531 \h </w:instrText>
         </w:r>
         <w:r>
           <w:rPr>
@@ -1335,7 +1335,7 @@
           <w14:ligatures w14:val="standardContextual"/>
         </w:rPr>
       </w:pPr>
-      <w:hyperlink w:anchor="_Toc241973901" w:history="1">
+      <w:hyperlink w:anchor="_Toc241974532" w:history="1">
         <w:r>
           <w:rPr>
             <w:rStyle w:val="Hipervnculo"/>
@@ -1362,7 +1362,7 @@
             <w:noProof/>
             <w:webHidden/>
           </w:rPr>
-          <w:instrText xml:space="preserve"> PAGEREF _Toc241973901 \h </w:instrText>
+          <w:instrText xml:space="preserve"> PAGEREF _Toc241974532 \h </w:instrText>
         </w:r>
         <w:r>
           <w:rPr>
@@ -1410,7 +1410,7 @@
           <w14:ligatures w14:val="standardContextual"/>
         </w:rPr>
       </w:pPr>
-      <w:hyperlink w:anchor="_Toc241973902" w:history="1">
+      <w:hyperlink w:anchor="_Toc241974533" w:history="1">
         <w:r>
           <w:rPr>
             <w:rStyle w:val="Hipervnculo"/>
@@ -1437,7 +1437,7 @@
             <w:noProof/>
             <w:webHidden/>
           </w:rPr>
-          <w:instrText xml:space="preserve"> PAGEREF _Toc241973902 \h </w:instrText>
+          <w:instrText xml:space="preserve"> PAGEREF _Toc241974533 \h </w:instrText>
         </w:r>
         <w:r>
           <w:rPr>
@@ -1482,9 +1482,9 @@
       <w:pPr>
         <w:pStyle w:val="Ttulo1"/>
       </w:pPr>
-      <w:bookmarkStart w:id="1" w:name="_Toc241973887"/>
+      <w:bookmarkStart w:id="1" w:name="_Toc241974518"/>
       <w:r>
-        <w:t>Introducción</w:t>
+        <w:t>1 Introducción</w:t>
       </w:r>
       <w:bookmarkEnd w:id="1"/>
     </w:p>
@@ -1510,9 +1510,9 @@
       <w:pPr>
         <w:pStyle w:val="Ttulo1"/>
       </w:pPr>
-      <w:bookmarkStart w:id="2" w:name="_Toc241973888"/>
+      <w:bookmarkStart w:id="2" w:name="_Toc241974519"/>
       <w:r>
-        <w:t>II Diseño de soluciones algorítmicas</w:t>
+        <w:t>2 Diseño de soluciones algorítmicas</w:t>
       </w:r>
       <w:bookmarkEnd w:id="2"/>
     </w:p>
@@ -1520,9 +1520,9 @@
       <w:pPr>
         <w:pStyle w:val="Ttulo2"/>
       </w:pPr>
-      <w:bookmarkStart w:id="3" w:name="_Toc241973889"/>
+      <w:bookmarkStart w:id="3" w:name="_Toc241974520"/>
       <w:r>
-        <w:t>II.a Codificación funcional y arquitectura del script</w:t>
+        <w:t>2.1 Codificación funcional y arquitectura del script</w:t>
       </w:r>
       <w:bookmarkEnd w:id="3"/>
     </w:p>
@@ -2624,9 +2624,9 @@
       <w:pPr>
         <w:pStyle w:val="Ttulo2"/>
       </w:pPr>
-      <w:bookmarkStart w:id="4" w:name="_Toc241973890"/>
+      <w:bookmarkStart w:id="4" w:name="_Toc241974521"/>
       <w:r>
-        <w:t>II.b Preprocesamiento y transformación del conjunto</w:t>
+        <w:t>2.2 Preprocesamiento y transformación del conjunto</w:t>
       </w:r>
       <w:bookmarkEnd w:id="4"/>
     </w:p>
@@ -3235,9 +3235,9 @@
       <w:pPr>
         <w:pStyle w:val="Ttulo2"/>
       </w:pPr>
-      <w:bookmarkStart w:id="5" w:name="_Toc241973891"/>
+      <w:bookmarkStart w:id="5" w:name="_Toc241974522"/>
       <w:r>
-        <w:t>II.c Validación técnica y verificación del código</w:t>
+        <w:t>2.3 Validación técnica y verificación del código</w:t>
       </w:r>
       <w:bookmarkEnd w:id="5"/>
     </w:p>
@@ -4021,9 +4021,9 @@
       <w:pPr>
         <w:pStyle w:val="Ttulo2"/>
       </w:pPr>
-      <w:bookmarkStart w:id="6" w:name="_Toc241973892"/>
+      <w:bookmarkStart w:id="6" w:name="_Toc241974523"/>
       <w:r>
-        <w:t>II.d Eficiencia y oportunidades de optimización</w:t>
+        <w:t>2.4 Eficiencia y oportunidades de optimización</w:t>
       </w:r>
       <w:bookmarkEnd w:id="6"/>
     </w:p>
@@ -4445,7 +4445,7 @@
           <w:noProof/>
         </w:rPr>
         <w:drawing>
-          <wp:inline distT="0" distB="0" distL="0" distR="0" wp14:anchorId="5F52EC0E" wp14:editId="0B36CFE6">
+          <wp:inline distT="0" distB="0" distL="0" distR="0" wp14:anchorId="6978B699" wp14:editId="5701F621">
             <wp:extent cx="5806440" cy="2220935"/>
             <wp:effectExtent l="0" t="0" r="0" b="0"/>
             <wp:docPr id="2" name="Picture 2"/>
@@ -4505,9 +4505,9 @@
       <w:pPr>
         <w:pStyle w:val="Ttulo2"/>
       </w:pPr>
-      <w:bookmarkStart w:id="7" w:name="_Toc241973893"/>
+      <w:bookmarkStart w:id="7" w:name="_Toc241974524"/>
       <w:r>
-        <w:t>II.e Diseño estructurado división funcional y escalabilidad</w:t>
+        <w:t>2.5 Diseño estructurado división funcional y escalabilidad</w:t>
       </w:r>
       <w:bookmarkEnd w:id="7"/>
     </w:p>
@@ -4525,9 +4525,9 @@
       <w:pPr>
         <w:pStyle w:val="Ttulo1"/>
       </w:pPr>
-      <w:bookmarkStart w:id="8" w:name="_Toc241973894"/>
+      <w:bookmarkStart w:id="8" w:name="_Toc241974525"/>
       <w:r>
-        <w:t>III Código modular y robusto</w:t>
+        <w:t>3 Código modular y robusto</w:t>
       </w:r>
       <w:bookmarkEnd w:id="8"/>
     </w:p>
@@ -4535,9 +4535,9 @@
       <w:pPr>
         <w:pStyle w:val="Ttulo2"/>
       </w:pPr>
-      <w:bookmarkStart w:id="9" w:name="_Toc241973895"/>
+      <w:bookmarkStart w:id="9" w:name="_Toc241974526"/>
       <w:r>
-        <w:t>III.a Programación orientada a objetos</w:t>
+        <w:t>3.1 Programación orientada a objetos</w:t>
       </w:r>
       <w:bookmarkEnd w:id="9"/>
     </w:p>
@@ -5055,9 +5055,9 @@
       <w:pPr>
         <w:pStyle w:val="Ttulo2"/>
       </w:pPr>
-      <w:bookmarkStart w:id="10" w:name="_Toc241973896"/>
+      <w:bookmarkStart w:id="10" w:name="_Toc241974527"/>
       <w:r>
-        <w:t>III.b Arquitectura funcionalidad y patrón Factory</w:t>
+        <w:t>3.2 Arquitectura funcionalidad y patrón Factory</w:t>
       </w:r>
       <w:bookmarkEnd w:id="10"/>
     </w:p>
@@ -5070,7 +5070,7 @@
           <w:noProof/>
         </w:rPr>
         <w:drawing>
-          <wp:inline distT="0" distB="0" distL="0" distR="0" wp14:anchorId="50D252DE" wp14:editId="2FC1DDD9">
+          <wp:inline distT="0" distB="0" distL="0" distR="0" wp14:anchorId="014C3512" wp14:editId="639CA849">
             <wp:extent cx="6080760" cy="2624913"/>
             <wp:effectExtent l="0" t="0" r="0" b="0"/>
             <wp:docPr id="3" name="Picture 3"/>
@@ -5726,9 +5726,9 @@
       <w:pPr>
         <w:pStyle w:val="Ttulo1"/>
       </w:pPr>
-      <w:bookmarkStart w:id="11" w:name="_Toc241973897"/>
+      <w:bookmarkStart w:id="11" w:name="_Toc241974528"/>
       <w:r>
-        <w:t>IV Repositorio GitHub</w:t>
+        <w:t>4 Repositorio GitHub</w:t>
       </w:r>
       <w:bookmarkEnd w:id="11"/>
     </w:p>
@@ -5822,9 +5822,9 @@
       <w:pPr>
         <w:pStyle w:val="Ttulo1"/>
       </w:pPr>
-      <w:bookmarkStart w:id="12" w:name="_Toc241973898"/>
+      <w:bookmarkStart w:id="12" w:name="_Toc241974529"/>
       <w:r>
-        <w:t>V Notebook ejecutable y productos</w:t>
+        <w:t>5 Notebook ejecutable y productos</w:t>
       </w:r>
       <w:bookmarkEnd w:id="12"/>
     </w:p>
@@ -6530,9 +6530,9 @@
       <w:pPr>
         <w:pStyle w:val="Ttulo1"/>
       </w:pPr>
-      <w:bookmarkStart w:id="13" w:name="_Toc241973899"/>
+      <w:bookmarkStart w:id="13" w:name="_Toc241974530"/>
       <w:r>
-        <w:t>Conclusiones</w:t>
+        <w:t>6 Conclusiones</w:t>
       </w:r>
       <w:bookmarkEnd w:id="13"/>
     </w:p>
@@ -6555,9 +6555,9 @@
       <w:pPr>
         <w:pStyle w:val="Ttulo1"/>
       </w:pPr>
-      <w:bookmarkStart w:id="14" w:name="_Toc241973900"/>
+      <w:bookmarkStart w:id="14" w:name="_Toc241974531"/>
       <w:r>
-        <w:t>VI Bibliografía y aspectos formales</w:t>
+        <w:t>7 Bibliografía y aspectos formales</w:t>
       </w:r>
       <w:bookmarkEnd w:id="14"/>
     </w:p>
@@ -6654,7 +6654,7 @@
       <w:pPr>
         <w:pStyle w:val="Ttulo1"/>
       </w:pPr>
-      <w:bookmarkStart w:id="15" w:name="_Toc241973901"/>
+      <w:bookmarkStart w:id="15" w:name="_Toc241974532"/>
       <w:r>
         <w:t>Anexo Matriz de cobertura</w:t>
       </w:r>
@@ -6923,7 +6923,7 @@
               <w:rPr>
                 <w:sz w:val="18"/>
               </w:rPr>
-              <w:t>Apartado II.a y notebook</w:t>
+              <w:t>Sección 2.1 y notebook</w:t>
             </w:r>
           </w:p>
         </w:tc>
@@ -7017,7 +7017,7 @@
               <w:rPr>
                 <w:sz w:val="18"/>
               </w:rPr>
-              <w:t>Apartado II.b y equivalencia con F2</w:t>
+              <w:t>Sección 2.2 y equivalencia con F2</w:t>
             </w:r>
           </w:p>
         </w:tc>
@@ -7111,7 +7111,7 @@
               <w:rPr>
                 <w:sz w:val="18"/>
               </w:rPr>
-              <w:t>Apartado II.c casos normales límite y excepciones</w:t>
+              <w:t>Sección 2.3 casos normales límite y excepciones</w:t>
             </w:r>
           </w:p>
         </w:tc>
@@ -7205,7 +7205,7 @@
               <w:rPr>
                 <w:sz w:val="18"/>
               </w:rPr>
-              <w:t>Apartado II.d tiempo memoria y crecimiento</w:t>
+              <w:t>Sección 2.4 tiempo memoria y crecimiento</w:t>
             </w:r>
           </w:p>
         </w:tc>
@@ -7298,7 +7298,7 @@
               <w:rPr>
                 <w:sz w:val="18"/>
               </w:rPr>
-              <w:t>Apartado II.e cohesión acoplamiento y división</w:t>
+              <w:t>Sección 2.5 cohesión acoplamiento y división</w:t>
             </w:r>
           </w:p>
         </w:tc>
@@ -7392,7 +7392,7 @@
               <w:rPr>
                 <w:sz w:val="18"/>
               </w:rPr>
-              <w:t>Apartado III.a herencia polimorfismo y encapsulamiento</w:t>
+              <w:t>Sección 3.1 herencia polimorfismo y encapsulamiento</w:t>
             </w:r>
           </w:p>
         </w:tc>
@@ -7486,7 +7486,7 @@
               <w:rPr>
                 <w:sz w:val="18"/>
               </w:rPr>
-              <w:t>Apartado III.b patrón Factory y módulos</w:t>
+              <w:t>Sección 3.2 patrón Factory y módulos</w:t>
             </w:r>
           </w:p>
         </w:tc>
@@ -7580,7 +7580,7 @@
               <w:rPr>
                 <w:sz w:val="18"/>
               </w:rPr>
-              <w:t>Apartado IV README módulos y commits</w:t>
+              <w:t>Sección 4 README módulos y commits</w:t>
             </w:r>
           </w:p>
         </w:tc>
@@ -7674,7 +7674,7 @@
               <w:rPr>
                 <w:sz w:val="18"/>
               </w:rPr>
-              <w:t>Apartado V ejecución completa y productos</w:t>
+              <w:t>Sección 5 ejecución completa y productos</w:t>
             </w:r>
           </w:p>
         </w:tc>
@@ -7823,7 +7823,7 @@
       <w:pPr>
         <w:pStyle w:val="Ttulo1"/>
       </w:pPr>
-      <w:bookmarkStart w:id="16" w:name="_Toc241973902"/>
+      <w:bookmarkStart w:id="16" w:name="_Toc241974533"/>
       <w:r>
         <w:t>Anexo Resultados de la verificación final</w:t>
       </w:r>
@@ -9085,31 +9085,31 @@
       </w:rPr>
     </w:lvl>
   </w:abstractNum>
-  <w:num w:numId="1" w16cid:durableId="1024597101">
+  <w:num w:numId="1" w16cid:durableId="123620193">
     <w:abstractNumId w:val="8"/>
   </w:num>
-  <w:num w:numId="2" w16cid:durableId="1836723771">
+  <w:num w:numId="2" w16cid:durableId="582420592">
     <w:abstractNumId w:val="6"/>
   </w:num>
-  <w:num w:numId="3" w16cid:durableId="411775870">
+  <w:num w:numId="3" w16cid:durableId="325208373">
     <w:abstractNumId w:val="5"/>
   </w:num>
-  <w:num w:numId="4" w16cid:durableId="465852250">
+  <w:num w:numId="4" w16cid:durableId="68354974">
     <w:abstractNumId w:val="4"/>
   </w:num>
-  <w:num w:numId="5" w16cid:durableId="681933386">
+  <w:num w:numId="5" w16cid:durableId="20130754">
     <w:abstractNumId w:val="7"/>
   </w:num>
-  <w:num w:numId="6" w16cid:durableId="601230200">
+  <w:num w:numId="6" w16cid:durableId="857891825">
     <w:abstractNumId w:val="3"/>
   </w:num>
-  <w:num w:numId="7" w16cid:durableId="1055620866">
+  <w:num w:numId="7" w16cid:durableId="1847817172">
     <w:abstractNumId w:val="2"/>
   </w:num>
-  <w:num w:numId="8" w16cid:durableId="448860857">
+  <w:num w:numId="8" w16cid:durableId="335812673">
     <w:abstractNumId w:val="1"/>
   </w:num>
-  <w:num w:numId="9" w16cid:durableId="299846101">
+  <w:num w:numId="9" w16cid:durableId="741562639">
     <w:abstractNumId w:val="0"/>
   </w:num>
 </w:numbering>
@@ -20510,7 +20510,7 @@
     <w:autoRedefine/>
     <w:uiPriority w:val="39"/>
     <w:unhideWhenUsed/>
-    <w:rsid w:val="00840A33"/>
+    <w:rsid w:val="00791D8B"/>
     <w:pPr>
       <w:spacing w:after="100"/>
     </w:pPr>
@@ -20522,7 +20522,7 @@
     <w:autoRedefine/>
     <w:uiPriority w:val="39"/>
     <w:unhideWhenUsed/>
-    <w:rsid w:val="00840A33"/>
+    <w:rsid w:val="00791D8B"/>
     <w:pPr>
       <w:spacing w:after="100"/>
       <w:ind w:left="210"/>
@@ -20533,7 +20533,7 @@
     <w:basedOn w:val="Fuentedeprrafopredeter"/>
     <w:uiPriority w:val="99"/>
     <w:unhideWhenUsed/>
-    <w:rsid w:val="00840A33"/>
+    <w:rsid w:val="00791D8B"/>
     <w:rPr>
       <w:color w:val="0000FF" w:themeColor="hyperlink"/>
       <w:u w:val="single"/>

</xml_diff>

<commit_message>
completa analisis y entregables de la fase 4
</commit_message>
<xml_diff>
--- a/f3_s02_entregable_grupo9.docx
+++ b/f3_s02_entregable_grupo9.docx
@@ -11,7 +11,7 @@
           <w:noProof/>
         </w:rPr>
         <w:drawing>
-          <wp:inline distT="0" distB="0" distL="0" distR="0" wp14:anchorId="2DD72506" wp14:editId="31B43597">
+          <wp:inline distT="0" distB="0" distL="0" distR="0" wp14:anchorId="1A4133E8" wp14:editId="5271141C">
             <wp:extent cx="1417320" cy="1144102"/>
             <wp:effectExtent l="0" t="0" r="0" b="0"/>
             <wp:docPr id="1" name="Picture 1"/>
@@ -176,13 +176,13 @@
     </w:p>
     <w:p>
       <w:pPr>
-        <w:pStyle w:val="Ttulo1"/>
+        <w:pStyle w:val="Ttulo"/>
+        <w:keepNext/>
       </w:pPr>
-      <w:bookmarkStart w:id="0" w:name="_Toc241974517"/>
       <w:r>
+        <w:lastRenderedPageBreak/>
         <w:t>Índice</w:t>
       </w:r>
-      <w:bookmarkEnd w:id="0"/>
     </w:p>
     <w:p>
       <w:pPr>
@@ -210,82 +210,7 @@
       <w:r>
         <w:fldChar w:fldCharType="separate"/>
       </w:r>
-      <w:hyperlink w:anchor="_Toc241974517" w:history="1">
-        <w:r>
-          <w:rPr>
-            <w:rStyle w:val="Hipervnculo"/>
-            <w:noProof/>
-          </w:rPr>
-          <w:t>Índice</w:t>
-        </w:r>
-        <w:r>
-          <w:rPr>
-            <w:noProof/>
-            <w:webHidden/>
-          </w:rPr>
-          <w:tab/>
-        </w:r>
-        <w:r>
-          <w:rPr>
-            <w:noProof/>
-            <w:webHidden/>
-          </w:rPr>
-          <w:fldChar w:fldCharType="begin"/>
-        </w:r>
-        <w:r>
-          <w:rPr>
-            <w:noProof/>
-            <w:webHidden/>
-          </w:rPr>
-          <w:instrText xml:space="preserve"> PAGEREF _Toc241974517 \h </w:instrText>
-        </w:r>
-        <w:r>
-          <w:rPr>
-            <w:noProof/>
-            <w:webHidden/>
-          </w:rPr>
-        </w:r>
-        <w:r>
-          <w:rPr>
-            <w:noProof/>
-            <w:webHidden/>
-          </w:rPr>
-          <w:fldChar w:fldCharType="separate"/>
-        </w:r>
-        <w:r>
-          <w:rPr>
-            <w:noProof/>
-            <w:webHidden/>
-          </w:rPr>
-          <w:t>2</w:t>
-        </w:r>
-        <w:r>
-          <w:rPr>
-            <w:noProof/>
-            <w:webHidden/>
-          </w:rPr>
-          <w:fldChar w:fldCharType="end"/>
-        </w:r>
-      </w:hyperlink>
-    </w:p>
-    <w:p>
-      <w:pPr>
-        <w:pStyle w:val="TDC1"/>
-        <w:tabs>
-          <w:tab w:val="right" w:leader="dot" w:pos="9868"/>
-        </w:tabs>
-        <w:rPr>
-          <w:rFonts w:asciiTheme="minorHAnsi" w:hAnsiTheme="minorHAnsi"/>
-          <w:noProof/>
-          <w:color w:val="auto"/>
-          <w:kern w:val="2"/>
-          <w:sz w:val="24"/>
-          <w:szCs w:val="24"/>
-          <w:lang w:val="es-CL" w:eastAsia="es-CL"/>
-          <w14:ligatures w14:val="standardContextual"/>
-        </w:rPr>
-      </w:pPr>
-      <w:hyperlink w:anchor="_Toc241974518" w:history="1">
+      <w:hyperlink w:anchor="_Toc241975383" w:history="1">
         <w:r>
           <w:rPr>
             <w:rStyle w:val="Hipervnculo"/>
@@ -312,7 +237,7 @@
             <w:noProof/>
             <w:webHidden/>
           </w:rPr>
-          <w:instrText xml:space="preserve"> PAGEREF _Toc241974518 \h </w:instrText>
+          <w:instrText xml:space="preserve"> PAGEREF _Toc241975383 \h </w:instrText>
         </w:r>
         <w:r>
           <w:rPr>
@@ -360,7 +285,7 @@
           <w14:ligatures w14:val="standardContextual"/>
         </w:rPr>
       </w:pPr>
-      <w:hyperlink w:anchor="_Toc241974519" w:history="1">
+      <w:hyperlink w:anchor="_Toc241975384" w:history="1">
         <w:r>
           <w:rPr>
             <w:rStyle w:val="Hipervnculo"/>
@@ -387,7 +312,7 @@
             <w:noProof/>
             <w:webHidden/>
           </w:rPr>
-          <w:instrText xml:space="preserve"> PAGEREF _Toc241974519 \h </w:instrText>
+          <w:instrText xml:space="preserve"> PAGEREF _Toc241975384 \h </w:instrText>
         </w:r>
         <w:r>
           <w:rPr>
@@ -435,7 +360,7 @@
           <w14:ligatures w14:val="standardContextual"/>
         </w:rPr>
       </w:pPr>
-      <w:hyperlink w:anchor="_Toc241974520" w:history="1">
+      <w:hyperlink w:anchor="_Toc241975385" w:history="1">
         <w:r>
           <w:rPr>
             <w:rStyle w:val="Hipervnculo"/>
@@ -462,7 +387,7 @@
             <w:noProof/>
             <w:webHidden/>
           </w:rPr>
-          <w:instrText xml:space="preserve"> PAGEREF _Toc241974520 \h </w:instrText>
+          <w:instrText xml:space="preserve"> PAGEREF _Toc241975385 \h </w:instrText>
         </w:r>
         <w:r>
           <w:rPr>
@@ -510,7 +435,7 @@
           <w14:ligatures w14:val="standardContextual"/>
         </w:rPr>
       </w:pPr>
-      <w:hyperlink w:anchor="_Toc241974521" w:history="1">
+      <w:hyperlink w:anchor="_Toc241975386" w:history="1">
         <w:r>
           <w:rPr>
             <w:rStyle w:val="Hipervnculo"/>
@@ -537,7 +462,7 @@
             <w:noProof/>
             <w:webHidden/>
           </w:rPr>
-          <w:instrText xml:space="preserve"> PAGEREF _Toc241974521 \h </w:instrText>
+          <w:instrText xml:space="preserve"> PAGEREF _Toc241975386 \h </w:instrText>
         </w:r>
         <w:r>
           <w:rPr>
@@ -585,7 +510,7 @@
           <w14:ligatures w14:val="standardContextual"/>
         </w:rPr>
       </w:pPr>
-      <w:hyperlink w:anchor="_Toc241974522" w:history="1">
+      <w:hyperlink w:anchor="_Toc241975387" w:history="1">
         <w:r>
           <w:rPr>
             <w:rStyle w:val="Hipervnculo"/>
@@ -612,7 +537,7 @@
             <w:noProof/>
             <w:webHidden/>
           </w:rPr>
-          <w:instrText xml:space="preserve"> PAGEREF _Toc241974522 \h </w:instrText>
+          <w:instrText xml:space="preserve"> PAGEREF _Toc241975387 \h </w:instrText>
         </w:r>
         <w:r>
           <w:rPr>
@@ -660,7 +585,7 @@
           <w14:ligatures w14:val="standardContextual"/>
         </w:rPr>
       </w:pPr>
-      <w:hyperlink w:anchor="_Toc241974523" w:history="1">
+      <w:hyperlink w:anchor="_Toc241975388" w:history="1">
         <w:r>
           <w:rPr>
             <w:rStyle w:val="Hipervnculo"/>
@@ -687,7 +612,7 @@
             <w:noProof/>
             <w:webHidden/>
           </w:rPr>
-          <w:instrText xml:space="preserve"> PAGEREF _Toc241974523 \h </w:instrText>
+          <w:instrText xml:space="preserve"> PAGEREF _Toc241975388 \h </w:instrText>
         </w:r>
         <w:r>
           <w:rPr>
@@ -735,7 +660,7 @@
           <w14:ligatures w14:val="standardContextual"/>
         </w:rPr>
       </w:pPr>
-      <w:hyperlink w:anchor="_Toc241974524" w:history="1">
+      <w:hyperlink w:anchor="_Toc241975389" w:history="1">
         <w:r>
           <w:rPr>
             <w:rStyle w:val="Hipervnculo"/>
@@ -762,7 +687,7 @@
             <w:noProof/>
             <w:webHidden/>
           </w:rPr>
-          <w:instrText xml:space="preserve"> PAGEREF _Toc241974524 \h </w:instrText>
+          <w:instrText xml:space="preserve"> PAGEREF _Toc241975389 \h </w:instrText>
         </w:r>
         <w:r>
           <w:rPr>
@@ -810,7 +735,7 @@
           <w14:ligatures w14:val="standardContextual"/>
         </w:rPr>
       </w:pPr>
-      <w:hyperlink w:anchor="_Toc241974525" w:history="1">
+      <w:hyperlink w:anchor="_Toc241975390" w:history="1">
         <w:r>
           <w:rPr>
             <w:rStyle w:val="Hipervnculo"/>
@@ -837,7 +762,7 @@
             <w:noProof/>
             <w:webHidden/>
           </w:rPr>
-          <w:instrText xml:space="preserve"> PAGEREF _Toc241974525 \h </w:instrText>
+          <w:instrText xml:space="preserve"> PAGEREF _Toc241975390 \h </w:instrText>
         </w:r>
         <w:r>
           <w:rPr>
@@ -885,7 +810,7 @@
           <w14:ligatures w14:val="standardContextual"/>
         </w:rPr>
       </w:pPr>
-      <w:hyperlink w:anchor="_Toc241974526" w:history="1">
+      <w:hyperlink w:anchor="_Toc241975391" w:history="1">
         <w:r>
           <w:rPr>
             <w:rStyle w:val="Hipervnculo"/>
@@ -912,7 +837,7 @@
             <w:noProof/>
             <w:webHidden/>
           </w:rPr>
-          <w:instrText xml:space="preserve"> PAGEREF _Toc241974526 \h </w:instrText>
+          <w:instrText xml:space="preserve"> PAGEREF _Toc241975391 \h </w:instrText>
         </w:r>
         <w:r>
           <w:rPr>
@@ -960,7 +885,7 @@
           <w14:ligatures w14:val="standardContextual"/>
         </w:rPr>
       </w:pPr>
-      <w:hyperlink w:anchor="_Toc241974527" w:history="1">
+      <w:hyperlink w:anchor="_Toc241975392" w:history="1">
         <w:r>
           <w:rPr>
             <w:rStyle w:val="Hipervnculo"/>
@@ -987,7 +912,7 @@
             <w:noProof/>
             <w:webHidden/>
           </w:rPr>
-          <w:instrText xml:space="preserve"> PAGEREF _Toc241974527 \h </w:instrText>
+          <w:instrText xml:space="preserve"> PAGEREF _Toc241975392 \h </w:instrText>
         </w:r>
         <w:r>
           <w:rPr>
@@ -1035,7 +960,7 @@
           <w14:ligatures w14:val="standardContextual"/>
         </w:rPr>
       </w:pPr>
-      <w:hyperlink w:anchor="_Toc241974528" w:history="1">
+      <w:hyperlink w:anchor="_Toc241975393" w:history="1">
         <w:r>
           <w:rPr>
             <w:rStyle w:val="Hipervnculo"/>
@@ -1062,7 +987,7 @@
             <w:noProof/>
             <w:webHidden/>
           </w:rPr>
-          <w:instrText xml:space="preserve"> PAGEREF _Toc241974528 \h </w:instrText>
+          <w:instrText xml:space="preserve"> PAGEREF _Toc241975393 \h </w:instrText>
         </w:r>
         <w:r>
           <w:rPr>
@@ -1110,7 +1035,7 @@
           <w14:ligatures w14:val="standardContextual"/>
         </w:rPr>
       </w:pPr>
-      <w:hyperlink w:anchor="_Toc241974529" w:history="1">
+      <w:hyperlink w:anchor="_Toc241975394" w:history="1">
         <w:r>
           <w:rPr>
             <w:rStyle w:val="Hipervnculo"/>
@@ -1137,7 +1062,7 @@
             <w:noProof/>
             <w:webHidden/>
           </w:rPr>
-          <w:instrText xml:space="preserve"> PAGEREF _Toc241974529 \h </w:instrText>
+          <w:instrText xml:space="preserve"> PAGEREF _Toc241975394 \h </w:instrText>
         </w:r>
         <w:r>
           <w:rPr>
@@ -1185,13 +1110,13 @@
           <w14:ligatures w14:val="standardContextual"/>
         </w:rPr>
       </w:pPr>
-      <w:hyperlink w:anchor="_Toc241974530" w:history="1">
+      <w:hyperlink w:anchor="_Toc241975395" w:history="1">
         <w:r>
           <w:rPr>
             <w:rStyle w:val="Hipervnculo"/>
             <w:noProof/>
           </w:rPr>
-          <w:t>6 Conclusiones</w:t>
+          <w:t>Conclusiones</w:t>
         </w:r>
         <w:r>
           <w:rPr>
@@ -1212,7 +1137,7 @@
             <w:noProof/>
             <w:webHidden/>
           </w:rPr>
-          <w:instrText xml:space="preserve"> PAGEREF _Toc241974530 \h </w:instrText>
+          <w:instrText xml:space="preserve"> PAGEREF _Toc241975395 \h </w:instrText>
         </w:r>
         <w:r>
           <w:rPr>
@@ -1260,13 +1185,13 @@
           <w14:ligatures w14:val="standardContextual"/>
         </w:rPr>
       </w:pPr>
-      <w:hyperlink w:anchor="_Toc241974531" w:history="1">
+      <w:hyperlink w:anchor="_Toc241975396" w:history="1">
         <w:r>
           <w:rPr>
             <w:rStyle w:val="Hipervnculo"/>
             <w:noProof/>
           </w:rPr>
-          <w:t>7 Bibliografía y aspectos formales</w:t>
+          <w:t>6 Bibliografía y aspectos formales</w:t>
         </w:r>
         <w:r>
           <w:rPr>
@@ -1287,7 +1212,7 @@
             <w:noProof/>
             <w:webHidden/>
           </w:rPr>
-          <w:instrText xml:space="preserve"> PAGEREF _Toc241974531 \h </w:instrText>
+          <w:instrText xml:space="preserve"> PAGEREF _Toc241975396 \h </w:instrText>
         </w:r>
         <w:r>
           <w:rPr>
@@ -1335,7 +1260,7 @@
           <w14:ligatures w14:val="standardContextual"/>
         </w:rPr>
       </w:pPr>
-      <w:hyperlink w:anchor="_Toc241974532" w:history="1">
+      <w:hyperlink w:anchor="_Toc241975397" w:history="1">
         <w:r>
           <w:rPr>
             <w:rStyle w:val="Hipervnculo"/>
@@ -1362,7 +1287,7 @@
             <w:noProof/>
             <w:webHidden/>
           </w:rPr>
-          <w:instrText xml:space="preserve"> PAGEREF _Toc241974532 \h </w:instrText>
+          <w:instrText xml:space="preserve"> PAGEREF _Toc241975397 \h </w:instrText>
         </w:r>
         <w:r>
           <w:rPr>
@@ -1410,7 +1335,7 @@
           <w14:ligatures w14:val="standardContextual"/>
         </w:rPr>
       </w:pPr>
-      <w:hyperlink w:anchor="_Toc241974533" w:history="1">
+      <w:hyperlink w:anchor="_Toc241975398" w:history="1">
         <w:r>
           <w:rPr>
             <w:rStyle w:val="Hipervnculo"/>
@@ -1437,7 +1362,7 @@
             <w:noProof/>
             <w:webHidden/>
           </w:rPr>
-          <w:instrText xml:space="preserve"> PAGEREF _Toc241974533 \h </w:instrText>
+          <w:instrText xml:space="preserve"> PAGEREF _Toc241975398 \h </w:instrText>
         </w:r>
         <w:r>
           <w:rPr>
@@ -1482,11 +1407,12 @@
       <w:pPr>
         <w:pStyle w:val="Ttulo1"/>
       </w:pPr>
-      <w:bookmarkStart w:id="1" w:name="_Toc241974518"/>
+      <w:bookmarkStart w:id="0" w:name="_Toc241975383"/>
       <w:r>
+        <w:lastRenderedPageBreak/>
         <w:t>1 Introducción</w:t>
       </w:r>
-      <w:bookmarkEnd w:id="1"/>
+      <w:bookmarkEnd w:id="0"/>
     </w:p>
     <w:p>
       <w:r>
@@ -1510,21 +1436,21 @@
       <w:pPr>
         <w:pStyle w:val="Ttulo1"/>
       </w:pPr>
-      <w:bookmarkStart w:id="2" w:name="_Toc241974519"/>
+      <w:bookmarkStart w:id="1" w:name="_Toc241975384"/>
       <w:r>
         <w:t>2 Diseño de soluciones algorítmicas</w:t>
       </w:r>
-      <w:bookmarkEnd w:id="2"/>
+      <w:bookmarkEnd w:id="1"/>
     </w:p>
     <w:p>
       <w:pPr>
         <w:pStyle w:val="Ttulo2"/>
       </w:pPr>
-      <w:bookmarkStart w:id="3" w:name="_Toc241974520"/>
+      <w:bookmarkStart w:id="2" w:name="_Toc241975385"/>
       <w:r>
         <w:t>2.1 Codificación funcional y arquitectura del script</w:t>
       </w:r>
-      <w:bookmarkEnd w:id="3"/>
+      <w:bookmarkEnd w:id="2"/>
     </w:p>
     <w:p>
       <w:r>
@@ -2263,6 +2189,7 @@
                 <w:b/>
                 <w:sz w:val="18"/>
               </w:rPr>
+              <w:lastRenderedPageBreak/>
               <w:t>Entrada</w:t>
             </w:r>
           </w:p>
@@ -2624,11 +2551,11 @@
       <w:pPr>
         <w:pStyle w:val="Ttulo2"/>
       </w:pPr>
-      <w:bookmarkStart w:id="4" w:name="_Toc241974521"/>
+      <w:bookmarkStart w:id="3" w:name="_Toc241975386"/>
       <w:r>
         <w:t>2.2 Preprocesamiento y transformación del conjunto</w:t>
       </w:r>
-      <w:bookmarkEnd w:id="4"/>
+      <w:bookmarkEnd w:id="3"/>
     </w:p>
     <w:p>
       <w:r>
@@ -3235,11 +3162,11 @@
       <w:pPr>
         <w:pStyle w:val="Ttulo2"/>
       </w:pPr>
-      <w:bookmarkStart w:id="5" w:name="_Toc241974522"/>
+      <w:bookmarkStart w:id="4" w:name="_Toc241975387"/>
       <w:r>
         <w:t>2.3 Validación técnica y verificación del código</w:t>
       </w:r>
-      <w:bookmarkEnd w:id="5"/>
+      <w:bookmarkEnd w:id="4"/>
     </w:p>
     <w:p>
       <w:r>
@@ -3930,6 +3857,7 @@
     </w:p>
     <w:p>
       <w:r>
+        <w:lastRenderedPageBreak/>
         <w:t>La comprobación principal se realizó con pandas.testing.assert_frame_equal. El conjunto generado por las clases se contrastó con los CSV de F2 usando tolerancias numéricas muy pequeñas. La prueba confirmó que la reorganización no cambió los datos ni el orden de las columnas. Esta equivalencia es la evidencia más directa de que el cambio de arquitectura no alteró el pipeline.</w:t>
       </w:r>
     </w:p>
@@ -4021,11 +3949,11 @@
       <w:pPr>
         <w:pStyle w:val="Ttulo2"/>
       </w:pPr>
-      <w:bookmarkStart w:id="6" w:name="_Toc241974523"/>
+      <w:bookmarkStart w:id="5" w:name="_Toc241975388"/>
       <w:r>
         <w:t>2.4 Eficiencia y oportunidades de optimización</w:t>
       </w:r>
-      <w:bookmarkEnd w:id="6"/>
+      <w:bookmarkEnd w:id="5"/>
     </w:p>
     <w:p>
       <w:r>
@@ -4445,7 +4373,7 @@
           <w:noProof/>
         </w:rPr>
         <w:drawing>
-          <wp:inline distT="0" distB="0" distL="0" distR="0" wp14:anchorId="6978B699" wp14:editId="5701F621">
+          <wp:inline distT="0" distB="0" distL="0" distR="0" wp14:anchorId="571D654A" wp14:editId="1DC3B009">
             <wp:extent cx="5806440" cy="2220935"/>
             <wp:effectExtent l="0" t="0" r="0" b="0"/>
             <wp:docPr id="2" name="Picture 2"/>
@@ -4505,11 +4433,12 @@
       <w:pPr>
         <w:pStyle w:val="Ttulo2"/>
       </w:pPr>
-      <w:bookmarkStart w:id="7" w:name="_Toc241974524"/>
+      <w:bookmarkStart w:id="6" w:name="_Toc241975389"/>
       <w:r>
+        <w:lastRenderedPageBreak/>
         <w:t>2.5 Diseño estructurado división funcional y escalabilidad</w:t>
       </w:r>
-      <w:bookmarkEnd w:id="7"/>
+      <w:bookmarkEnd w:id="6"/>
     </w:p>
     <w:p>
       <w:r>
@@ -4525,21 +4454,21 @@
       <w:pPr>
         <w:pStyle w:val="Ttulo1"/>
       </w:pPr>
-      <w:bookmarkStart w:id="8" w:name="_Toc241974525"/>
+      <w:bookmarkStart w:id="7" w:name="_Toc241975390"/>
       <w:r>
         <w:t>3 Código modular y robusto</w:t>
       </w:r>
-      <w:bookmarkEnd w:id="8"/>
+      <w:bookmarkEnd w:id="7"/>
     </w:p>
     <w:p>
       <w:pPr>
         <w:pStyle w:val="Ttulo2"/>
       </w:pPr>
-      <w:bookmarkStart w:id="9" w:name="_Toc241974526"/>
+      <w:bookmarkStart w:id="8" w:name="_Toc241975391"/>
       <w:r>
         <w:t>3.1 Programación orientada a objetos</w:t>
       </w:r>
-      <w:bookmarkEnd w:id="9"/>
+      <w:bookmarkEnd w:id="8"/>
     </w:p>
     <w:p>
       <w:r>
@@ -5055,11 +4984,12 @@
       <w:pPr>
         <w:pStyle w:val="Ttulo2"/>
       </w:pPr>
-      <w:bookmarkStart w:id="10" w:name="_Toc241974527"/>
+      <w:bookmarkStart w:id="9" w:name="_Toc241975392"/>
       <w:r>
+        <w:lastRenderedPageBreak/>
         <w:t>3.2 Arquitectura funcionalidad y patrón Factory</w:t>
       </w:r>
-      <w:bookmarkEnd w:id="10"/>
+      <w:bookmarkEnd w:id="9"/>
     </w:p>
     <w:p>
       <w:pPr>
@@ -5070,7 +5000,7 @@
           <w:noProof/>
         </w:rPr>
         <w:drawing>
-          <wp:inline distT="0" distB="0" distL="0" distR="0" wp14:anchorId="014C3512" wp14:editId="639CA849">
+          <wp:inline distT="0" distB="0" distL="0" distR="0" wp14:anchorId="77450F2D" wp14:editId="2F641D3F">
             <wp:extent cx="6080760" cy="2624913"/>
             <wp:effectExtent l="0" t="0" r="0" b="0"/>
             <wp:docPr id="3" name="Picture 3"/>
@@ -5726,11 +5656,12 @@
       <w:pPr>
         <w:pStyle w:val="Ttulo1"/>
       </w:pPr>
-      <w:bookmarkStart w:id="11" w:name="_Toc241974528"/>
+      <w:bookmarkStart w:id="10" w:name="_Toc241975393"/>
       <w:r>
+        <w:lastRenderedPageBreak/>
         <w:t>4 Repositorio GitHub</w:t>
       </w:r>
-      <w:bookmarkEnd w:id="11"/>
+      <w:bookmarkEnd w:id="10"/>
     </w:p>
     <w:p>
       <w:r>
@@ -5822,11 +5753,11 @@
       <w:pPr>
         <w:pStyle w:val="Ttulo1"/>
       </w:pPr>
-      <w:bookmarkStart w:id="12" w:name="_Toc241974529"/>
+      <w:bookmarkStart w:id="11" w:name="_Toc241975394"/>
       <w:r>
         <w:t>5 Notebook ejecutable y productos</w:t>
       </w:r>
-      <w:bookmarkEnd w:id="12"/>
+      <w:bookmarkEnd w:id="11"/>
     </w:p>
     <w:p>
       <w:r>
@@ -6530,11 +6461,11 @@
       <w:pPr>
         <w:pStyle w:val="Ttulo1"/>
       </w:pPr>
-      <w:bookmarkStart w:id="13" w:name="_Toc241974530"/>
+      <w:bookmarkStart w:id="12" w:name="_Toc241975395"/>
       <w:r>
-        <w:t>6 Conclusiones</w:t>
+        <w:t>Conclusiones</w:t>
       </w:r>
-      <w:bookmarkEnd w:id="13"/>
+      <w:bookmarkEnd w:id="12"/>
     </w:p>
     <w:p>
       <w:r>
@@ -6543,7 +6474,11 @@
     </w:p>
     <w:p>
       <w:r>
-        <w:t>La versión funcional presentó el menor costo de ejecución. La versión orientada a objetos agregó tiempo y memoria, pero hizo explícitas las responsabilidades, el estado y los controles. En este proyecto, la decisión se justifica por mantenibilidad y reutilización. El principal ajuste futuro consiste en escalar juntas las variables numéricas para disminuir copias y llamadas repetidas.</w:t>
+        <w:t xml:space="preserve">La versión funcional presentó el menor costo de ejecución. La versión orientada a objetos agregó tiempo y memoria, pero hizo explícitas las responsabilidades, el estado y los controles. En este proyecto, la decisión se </w:t>
+      </w:r>
+      <w:r>
+        <w:lastRenderedPageBreak/>
+        <w:t>justifica por mantenibilidad y reutilización. El principal ajuste futuro consiste en escalar juntas las variables numéricas para disminuir copias y llamadas repetidas.</w:t>
       </w:r>
     </w:p>
     <w:p>
@@ -6555,11 +6490,11 @@
       <w:pPr>
         <w:pStyle w:val="Ttulo1"/>
       </w:pPr>
-      <w:bookmarkStart w:id="14" w:name="_Toc241974531"/>
+      <w:bookmarkStart w:id="13" w:name="_Toc241975396"/>
       <w:r>
-        <w:t>7 Bibliografía y aspectos formales</w:t>
+        <w:t>6 Bibliografía y aspectos formales</w:t>
       </w:r>
-      <w:bookmarkEnd w:id="14"/>
+      <w:bookmarkEnd w:id="13"/>
     </w:p>
     <w:p>
       <w:pPr>
@@ -6654,11 +6589,12 @@
       <w:pPr>
         <w:pStyle w:val="Ttulo1"/>
       </w:pPr>
-      <w:bookmarkStart w:id="15" w:name="_Toc241974532"/>
+      <w:bookmarkStart w:id="14" w:name="_Toc241975397"/>
       <w:r>
+        <w:lastRenderedPageBreak/>
         <w:t>Anexo Matriz de cobertura</w:t>
       </w:r>
-      <w:bookmarkEnd w:id="15"/>
+      <w:bookmarkEnd w:id="14"/>
     </w:p>
     <w:tbl>
       <w:tblPr>
@@ -7823,11 +7759,12 @@
       <w:pPr>
         <w:pStyle w:val="Ttulo1"/>
       </w:pPr>
-      <w:bookmarkStart w:id="16" w:name="_Toc241974533"/>
+      <w:bookmarkStart w:id="15" w:name="_Toc241975398"/>
       <w:r>
+        <w:lastRenderedPageBreak/>
         <w:t>Anexo Resultados de la verificación final</w:t>
       </w:r>
-      <w:bookmarkEnd w:id="16"/>
+      <w:bookmarkEnd w:id="15"/>
     </w:p>
     <w:p>
       <w:r>
@@ -9085,31 +9022,31 @@
       </w:rPr>
     </w:lvl>
   </w:abstractNum>
-  <w:num w:numId="1" w16cid:durableId="123620193">
+  <w:num w:numId="1" w16cid:durableId="2134015004">
     <w:abstractNumId w:val="8"/>
   </w:num>
-  <w:num w:numId="2" w16cid:durableId="582420592">
+  <w:num w:numId="2" w16cid:durableId="1493183875">
     <w:abstractNumId w:val="6"/>
   </w:num>
-  <w:num w:numId="3" w16cid:durableId="325208373">
+  <w:num w:numId="3" w16cid:durableId="2114205102">
     <w:abstractNumId w:val="5"/>
   </w:num>
-  <w:num w:numId="4" w16cid:durableId="68354974">
+  <w:num w:numId="4" w16cid:durableId="984819675">
     <w:abstractNumId w:val="4"/>
   </w:num>
-  <w:num w:numId="5" w16cid:durableId="20130754">
+  <w:num w:numId="5" w16cid:durableId="501089322">
     <w:abstractNumId w:val="7"/>
   </w:num>
-  <w:num w:numId="6" w16cid:durableId="857891825">
+  <w:num w:numId="6" w16cid:durableId="1941332650">
     <w:abstractNumId w:val="3"/>
   </w:num>
-  <w:num w:numId="7" w16cid:durableId="1847817172">
+  <w:num w:numId="7" w16cid:durableId="1909489534">
     <w:abstractNumId w:val="2"/>
   </w:num>
-  <w:num w:numId="8" w16cid:durableId="335812673">
+  <w:num w:numId="8" w16cid:durableId="1865634463">
     <w:abstractNumId w:val="1"/>
   </w:num>
-  <w:num w:numId="9" w16cid:durableId="741562639">
+  <w:num w:numId="9" w16cid:durableId="1731343905">
     <w:abstractNumId w:val="0"/>
   </w:num>
 </w:numbering>
@@ -20510,7 +20447,7 @@
     <w:autoRedefine/>
     <w:uiPriority w:val="39"/>
     <w:unhideWhenUsed/>
-    <w:rsid w:val="00791D8B"/>
+    <w:rsid w:val="00F56D2A"/>
     <w:pPr>
       <w:spacing w:after="100"/>
     </w:pPr>
@@ -20522,7 +20459,7 @@
     <w:autoRedefine/>
     <w:uiPriority w:val="39"/>
     <w:unhideWhenUsed/>
-    <w:rsid w:val="00791D8B"/>
+    <w:rsid w:val="00F56D2A"/>
     <w:pPr>
       <w:spacing w:after="100"/>
       <w:ind w:left="210"/>
@@ -20533,7 +20470,7 @@
     <w:basedOn w:val="Fuentedeprrafopredeter"/>
     <w:uiPriority w:val="99"/>
     <w:unhideWhenUsed/>
-    <w:rsid w:val="00791D8B"/>
+    <w:rsid w:val="00F56D2A"/>
     <w:rPr>
       <w:color w:val="0000FF" w:themeColor="hyperlink"/>
       <w:u w:val="single"/>

</xml_diff>